<commit_message>
Lab5: replace manual TOC with a real Word TOC field (indexation)
</commit_message>
<xml_diff>
--- a/Lab5/Lab5_PlesuDinu_FAF-241.docx
+++ b/Lab5/Lab5_PlesuDinu_FAF-241.docx
@@ -232,354 +232,172 @@
     </w:p>
     <w:p>
       <w:pPr>
-        <w:spacing w:after="50" w:line="270" w:lineRule="auto"/>
-        <w:tabs>
-          <w:tab w:val="right" w:leader="dot" w:pos="9000"/>
-        </w:tabs>
-      </w:pPr>
-      <w:r>
-        <w:rPr>
-          <w:sz w:val="20"/>
-          <w:szCs w:val="20"/>
-        </w:rPr>
-        <w:t xml:space="preserve">1 Laboratory Work 5 – The File System with Your Own Hands</w:t>
-      </w:r>
-      <w:r>
-        <w:tab/>
-      </w:r>
-      <w:r>
-        <w:rPr>
-          <w:sz w:val="20"/>
-          <w:szCs w:val="20"/>
-        </w:rPr>
-        <w:t xml:space="preserve">3</w:t>
-      </w:r>
-    </w:p>
-    <w:p>
-      <w:pPr>
-        <w:spacing w:after="50" w:line="270" w:lineRule="auto"/>
-        <w:ind w:left="360"/>
-        <w:tabs>
-          <w:tab w:val="right" w:leader="dot" w:pos="9000"/>
-        </w:tabs>
-      </w:pPr>
-      <w:r>
-        <w:rPr>
-          <w:sz w:val="20"/>
-          <w:szCs w:val="20"/>
-        </w:rPr>
-        <w:t xml:space="preserve">1.1 Purpose of the Work</w:t>
-      </w:r>
-      <w:r>
-        <w:tab/>
-      </w:r>
-      <w:r>
-        <w:rPr>
-          <w:sz w:val="20"/>
-          <w:szCs w:val="20"/>
-        </w:rPr>
-        <w:t xml:space="preserve">3</w:t>
-      </w:r>
-    </w:p>
-    <w:p>
-      <w:pPr>
-        <w:spacing w:after="50" w:line="270" w:lineRule="auto"/>
-        <w:ind w:left="360"/>
-        <w:tabs>
-          <w:tab w:val="right" w:leader="dot" w:pos="9000"/>
-        </w:tabs>
-      </w:pPr>
-      <w:r>
-        <w:rPr>
-          <w:sz w:val="20"/>
-          <w:szCs w:val="20"/>
-        </w:rPr>
-        <w:t xml:space="preserve">1.2 Part 1 – Tree and file types</w:t>
-      </w:r>
-      <w:r>
-        <w:tab/>
-      </w:r>
-      <w:r>
-        <w:rPr>
-          <w:sz w:val="20"/>
-          <w:szCs w:val="20"/>
-        </w:rPr>
-        <w:t xml:space="preserve">3</w:t>
-      </w:r>
-    </w:p>
-    <w:p>
-      <w:pPr>
-        <w:spacing w:after="50" w:line="270" w:lineRule="auto"/>
-        <w:ind w:left="360"/>
-        <w:tabs>
-          <w:tab w:val="right" w:leader="dot" w:pos="9000"/>
-        </w:tabs>
-      </w:pPr>
-      <w:r>
-        <w:rPr>
-          <w:sz w:val="20"/>
-          <w:szCs w:val="20"/>
-        </w:rPr>
-        <w:t xml:space="preserve">1.3 Part 2 – Inodes and links</w:t>
-      </w:r>
-      <w:r>
-        <w:tab/>
-      </w:r>
-      <w:r>
-        <w:rPr>
-          <w:sz w:val="20"/>
-          <w:szCs w:val="20"/>
-        </w:rPr>
-        <w:t xml:space="preserve">3</w:t>
-      </w:r>
-    </w:p>
-    <w:p>
-      <w:pPr>
-        <w:spacing w:after="50" w:line="270" w:lineRule="auto"/>
-        <w:ind w:left="360"/>
-        <w:tabs>
-          <w:tab w:val="right" w:leader="dot" w:pos="9000"/>
-        </w:tabs>
-      </w:pPr>
-      <w:r>
-        <w:rPr>
-          <w:sz w:val="20"/>
-          <w:szCs w:val="20"/>
-        </w:rPr>
-        <w:t xml:space="preserve">1.4 Part 3 – Permissions</w:t>
-      </w:r>
-      <w:r>
-        <w:tab/>
-      </w:r>
-      <w:r>
-        <w:rPr>
-          <w:sz w:val="20"/>
-          <w:szCs w:val="20"/>
-        </w:rPr>
-        <w:t xml:space="preserve">4</w:t>
-      </w:r>
-    </w:p>
-    <w:p>
-      <w:pPr>
-        <w:spacing w:after="50" w:line="270" w:lineRule="auto"/>
-        <w:ind w:left="360"/>
-        <w:tabs>
-          <w:tab w:val="right" w:leader="dot" w:pos="9000"/>
-        </w:tabs>
-      </w:pPr>
-      <w:r>
-        <w:rPr>
-          <w:sz w:val="20"/>
-          <w:szCs w:val="20"/>
-        </w:rPr>
-        <w:t xml:space="preserve">1.5 Part 4 – Disks and kernel data as files</w:t>
-      </w:r>
-      <w:r>
-        <w:tab/>
-      </w:r>
-      <w:r>
-        <w:rPr>
-          <w:sz w:val="20"/>
-          <w:szCs w:val="20"/>
-        </w:rPr>
-        <w:t xml:space="preserve">5</w:t>
-      </w:r>
-    </w:p>
-    <w:p>
-      <w:pPr>
-        <w:spacing w:after="50" w:line="270" w:lineRule="auto"/>
-        <w:ind w:left="360"/>
-        <w:tabs>
-          <w:tab w:val="right" w:leader="dot" w:pos="9000"/>
-        </w:tabs>
-      </w:pPr>
-      <w:r>
-        <w:rPr>
-          <w:sz w:val="20"/>
-          <w:szCs w:val="20"/>
-        </w:rPr>
-        <w:t xml:space="preserve">1.6 Conclusion</w:t>
-      </w:r>
-      <w:r>
-        <w:tab/>
-      </w:r>
-      <w:r>
-        <w:rPr>
-          <w:sz w:val="20"/>
-          <w:szCs w:val="20"/>
-        </w:rPr>
-        <w:t xml:space="preserve">7</w:t>
-      </w:r>
-    </w:p>
-    <w:p>
-      <w:pPr>
-        <w:spacing w:after="50" w:line="270" w:lineRule="auto"/>
-        <w:tabs>
-          <w:tab w:val="right" w:leader="dot" w:pos="9000"/>
-        </w:tabs>
-      </w:pPr>
-      <w:r>
-        <w:rPr>
-          <w:sz w:val="20"/>
-          <w:szCs w:val="20"/>
-        </w:rPr>
-        <w:t xml:space="preserve">2 Laboratory Work 6 – Inside the xv6 File System</w:t>
-      </w:r>
-      <w:r>
-        <w:tab/>
-      </w:r>
-      <w:r>
-        <w:rPr>
-          <w:sz w:val="20"/>
-          <w:szCs w:val="20"/>
-        </w:rPr>
-        <w:t xml:space="preserve">7</w:t>
-      </w:r>
-    </w:p>
-    <w:p>
-      <w:pPr>
-        <w:spacing w:after="50" w:line="270" w:lineRule="auto"/>
-        <w:ind w:left="360"/>
-        <w:tabs>
-          <w:tab w:val="right" w:leader="dot" w:pos="9000"/>
-        </w:tabs>
-      </w:pPr>
-      <w:r>
-        <w:rPr>
-          <w:sz w:val="20"/>
-          <w:szCs w:val="20"/>
-        </w:rPr>
-        <w:t xml:space="preserve">2.1 Part 1 – Read what xv6 shows you</w:t>
-      </w:r>
-      <w:r>
-        <w:tab/>
-      </w:r>
-      <w:r>
-        <w:rPr>
-          <w:sz w:val="20"/>
-          <w:szCs w:val="20"/>
-        </w:rPr>
-        <w:t xml:space="preserve">7</w:t>
-      </w:r>
-    </w:p>
-    <w:p>
-      <w:pPr>
-        <w:spacing w:after="50" w:line="270" w:lineRule="auto"/>
-        <w:ind w:left="360"/>
-        <w:tabs>
-          <w:tab w:val="right" w:leader="dot" w:pos="9000"/>
-        </w:tabs>
-      </w:pPr>
-      <w:r>
-        <w:rPr>
-          <w:sz w:val="20"/>
-          <w:szCs w:val="20"/>
-        </w:rPr>
-        <w:t xml:space="preserve">2.2 Part 2 – Write mystat</w:t>
-      </w:r>
-      <w:r>
-        <w:tab/>
-      </w:r>
-      <w:r>
-        <w:rPr>
-          <w:sz w:val="20"/>
-          <w:szCs w:val="20"/>
-        </w:rPr>
-        <w:t xml:space="preserve">8</w:t>
-      </w:r>
-    </w:p>
-    <w:p>
-      <w:pPr>
-        <w:spacing w:after="50" w:line="270" w:lineRule="auto"/>
-        <w:ind w:left="360"/>
-        <w:tabs>
-          <w:tab w:val="right" w:leader="dot" w:pos="9000"/>
-        </w:tabs>
-      </w:pPr>
-      <w:r>
-        <w:rPr>
-          <w:sz w:val="20"/>
-          <w:szCs w:val="20"/>
-        </w:rPr>
-        <w:t xml:space="preserve">2.3 Part 3 – Measure the limits</w:t>
-      </w:r>
-      <w:r>
-        <w:tab/>
-      </w:r>
-      <w:r>
-        <w:rPr>
-          <w:sz w:val="20"/>
-          <w:szCs w:val="20"/>
-        </w:rPr>
-        <w:t xml:space="preserve">9</w:t>
-      </w:r>
-    </w:p>
-    <w:p>
-      <w:pPr>
-        <w:spacing w:after="50" w:line="270" w:lineRule="auto"/>
-        <w:ind w:left="360"/>
-        <w:tabs>
-          <w:tab w:val="right" w:leader="dot" w:pos="9000"/>
-        </w:tabs>
-      </w:pPr>
-      <w:r>
-        <w:rPr>
-          <w:sz w:val="20"/>
-          <w:szCs w:val="20"/>
-        </w:rPr>
-        <w:t xml:space="preserve">2.4 Part 4 – Write find</w:t>
-      </w:r>
-      <w:r>
-        <w:tab/>
-      </w:r>
-      <w:r>
-        <w:rPr>
-          <w:sz w:val="20"/>
-          <w:szCs w:val="20"/>
-        </w:rPr>
-        <w:t xml:space="preserve">11</w:t>
-      </w:r>
-    </w:p>
-    <w:p>
-      <w:pPr>
-        <w:spacing w:after="50" w:line="270" w:lineRule="auto"/>
-        <w:ind w:left="360"/>
-        <w:tabs>
-          <w:tab w:val="right" w:leader="dot" w:pos="9000"/>
-        </w:tabs>
-      </w:pPr>
-      <w:r>
-        <w:rPr>
-          <w:sz w:val="20"/>
-          <w:szCs w:val="20"/>
-        </w:rPr>
-        <w:t xml:space="preserve">2.5 Conclusion</w:t>
-      </w:r>
-      <w:r>
-        <w:tab/>
-      </w:r>
-      <w:r>
-        <w:rPr>
-          <w:sz w:val="20"/>
-          <w:szCs w:val="20"/>
-        </w:rPr>
-        <w:t xml:space="preserve">12</w:t>
-      </w:r>
-    </w:p>
-    <w:p>
-      <w:pPr>
-        <w:sectPr>
-          <w:pgSz w:w="11906" w:h="16838"/>
-          <w:pgMar w:top="1134" w:right="1134" w:bottom="1134" w:left="1134" w:header="500" w:footer="500"/>
-          <w:pgNumType w:start="2"/>
-          <w:footerReference w:type="default" r:id="rId8"/>
-        </w:sectPr>
-      </w:pPr>
-      <w:r>
-        <w:br w:type="page"/>
-      </w:r>
-    </w:p>
-    <w:p>
+        <w:spacing w:after="80"/>
+      </w:pPr>
+      <w:r>
+        <w:fldChar w:fldCharType="begin"/>
+      </w:r>
+      <w:r>
+        <w:instrText xml:space="preserve"> TOC \o "1-2" \h \z \u </w:instrText>
+      </w:r>
+      <w:r>
+        <w:fldChar w:fldCharType="separate"/>
+      </w:r>
+      <w:r>
+        <w:rPr>
+          <w:sz w:val="24"/>
+        </w:rPr>
+        <w:t>1.  Laboratory Work 5 – The File System with Your Own Hands</w:t>
+      </w:r>
+    </w:p>
+    <w:p>
+      <w:pPr>
+        <w:spacing w:after="80"/>
+        <w:ind w:left="425"/>
+      </w:pPr>
+      <w:r>
+        <w:rPr>
+          <w:sz w:val="24"/>
+        </w:rPr>
+        <w:t>1.1  Purpose of the Work</w:t>
+      </w:r>
+    </w:p>
+    <w:p>
+      <w:pPr>
+        <w:spacing w:after="80"/>
+        <w:ind w:left="425"/>
+      </w:pPr>
+      <w:r>
+        <w:rPr>
+          <w:sz w:val="24"/>
+        </w:rPr>
+        <w:t>1.2  Part 1 – Tree and file types</w:t>
+      </w:r>
+    </w:p>
+    <w:p>
+      <w:pPr>
+        <w:spacing w:after="80"/>
+        <w:ind w:left="425"/>
+      </w:pPr>
+      <w:r>
+        <w:rPr>
+          <w:sz w:val="24"/>
+        </w:rPr>
+        <w:t>1.3  Part 2 – Inodes and links</w:t>
+      </w:r>
+    </w:p>
+    <w:p>
+      <w:pPr>
+        <w:spacing w:after="80"/>
+        <w:ind w:left="425"/>
+      </w:pPr>
+      <w:r>
+        <w:rPr>
+          <w:sz w:val="24"/>
+        </w:rPr>
+        <w:t>1.4  Part 3 – Permissions</w:t>
+      </w:r>
+    </w:p>
+    <w:p>
+      <w:pPr>
+        <w:spacing w:after="80"/>
+        <w:ind w:left="425"/>
+      </w:pPr>
+      <w:r>
+        <w:rPr>
+          <w:sz w:val="24"/>
+        </w:rPr>
+        <w:t>1.5  Part 4 – Disks and kernel data as files</w:t>
+      </w:r>
+    </w:p>
+    <w:p>
+      <w:pPr>
+        <w:spacing w:after="80"/>
+        <w:ind w:left="425"/>
+      </w:pPr>
+      <w:r>
+        <w:rPr>
+          <w:sz w:val="24"/>
+        </w:rPr>
+        <w:t>1.6  Conclusion</w:t>
+      </w:r>
+    </w:p>
+    <w:p>
+      <w:pPr>
+        <w:spacing w:after="80"/>
+      </w:pPr>
+      <w:r>
+        <w:rPr>
+          <w:sz w:val="24"/>
+        </w:rPr>
+        <w:t>2.  Laboratory Work 6 – Inside the xv6 File System</w:t>
+      </w:r>
+    </w:p>
+    <w:p>
+      <w:pPr>
+        <w:spacing w:after="80"/>
+        <w:ind w:left="425"/>
+      </w:pPr>
+      <w:r>
+        <w:rPr>
+          <w:sz w:val="24"/>
+        </w:rPr>
+        <w:t>2.1  Part 1 – Read what xv6 shows you</w:t>
+      </w:r>
+    </w:p>
+    <w:p>
+      <w:pPr>
+        <w:spacing w:after="80"/>
+        <w:ind w:left="425"/>
+      </w:pPr>
+      <w:r>
+        <w:rPr>
+          <w:sz w:val="24"/>
+        </w:rPr>
+        <w:t>2.2  Part 2 – Write mystat</w:t>
+      </w:r>
+    </w:p>
+    <w:p>
+      <w:pPr>
+        <w:spacing w:after="80"/>
+        <w:ind w:left="425"/>
+      </w:pPr>
+      <w:r>
+        <w:rPr>
+          <w:sz w:val="24"/>
+        </w:rPr>
+        <w:t>2.3  Part 3 – Measure the limits</w:t>
+      </w:r>
+    </w:p>
+    <w:p>
+      <w:pPr>
+        <w:spacing w:after="80"/>
+        <w:ind w:left="425"/>
+      </w:pPr>
+      <w:r>
+        <w:rPr>
+          <w:sz w:val="24"/>
+        </w:rPr>
+        <w:t>2.4  Part 4 – Write find</w:t>
+      </w:r>
+    </w:p>
+    <w:p>
+      <w:pPr>
+        <w:spacing w:after="80"/>
+        <w:ind w:left="425"/>
+      </w:pPr>
+      <w:r>
+        <w:rPr>
+          <w:sz w:val="24"/>
+        </w:rPr>
+        <w:t>2.5  Conclusion</w:t>
+      </w:r>
+      <w:r>
+        <w:fldChar w:fldCharType="end"/>
+      </w:r>
+    </w:p>
+    <w:p>
+      <w:bookmarkStart w:id="1001" w:name="_Toc1001"/>
       <w:pPr>
         <w:pStyle w:val="Heading1"/>
         <w:jc w:val="left"/>
@@ -594,8 +412,10 @@
         <w:t xml:space="preserve">1.  Laboratory Work 5 – The File System with Your Own Hands</w:t>
       </w:r>
       <w:bookmarkEnd w:id="2"/>
-    </w:p>
-    <w:p>
+      <w:bookmarkEnd w:id="1001"/>
+    </w:p>
+    <w:p>
+      <w:bookmarkStart w:id="1002" w:name="_Toc1002"/>
       <w:pPr>
         <w:pStyle w:val="Heading2"/>
         <w:jc w:val="left"/>
@@ -610,6 +430,7 @@
         <w:t xml:space="preserve">1.1  Purpose of the Work</w:t>
       </w:r>
       <w:bookmarkEnd w:id="3"/>
+      <w:bookmarkEnd w:id="1002"/>
     </w:p>
     <w:p>
       <w:pPr>
@@ -632,6 +453,7 @@
       </w:r>
     </w:p>
     <w:p>
+      <w:bookmarkStart w:id="1003" w:name="_Toc1003"/>
       <w:pPr>
         <w:pStyle w:val="Heading2"/>
         <w:jc w:val="left"/>
@@ -646,6 +468,7 @@
         <w:t xml:space="preserve">1.2  Part 1 – Tree and file types</w:t>
       </w:r>
       <w:bookmarkEnd w:id="4"/>
+      <w:bookmarkEnd w:id="1003"/>
     </w:p>
     <w:p>
       <w:pPr>
@@ -1004,6 +827,7 @@
       </w:r>
     </w:p>
     <w:p>
+      <w:bookmarkStart w:id="1004" w:name="_Toc1004"/>
       <w:pPr>
         <w:pStyle w:val="Heading2"/>
         <w:jc w:val="left"/>
@@ -1018,6 +842,7 @@
         <w:t xml:space="preserve">1.3  Part 2 – Inodes and links</w:t>
       </w:r>
       <w:bookmarkEnd w:id="5"/>
+      <w:bookmarkEnd w:id="1004"/>
     </w:p>
     <w:p>
       <w:pPr>
@@ -1278,6 +1103,7 @@
       </w:r>
     </w:p>
     <w:p>
+      <w:bookmarkStart w:id="1005" w:name="_Toc1005"/>
       <w:pPr>
         <w:pStyle w:val="Heading2"/>
         <w:jc w:val="left"/>
@@ -1292,6 +1118,7 @@
         <w:t xml:space="preserve">1.4  Part 3 – Permissions</w:t>
       </w:r>
       <w:bookmarkEnd w:id="6"/>
+      <w:bookmarkEnd w:id="1005"/>
     </w:p>
     <w:tbl>
       <w:tblPr>
@@ -1924,6 +1751,7 @@
       </w:r>
     </w:p>
     <w:p>
+      <w:bookmarkStart w:id="1006" w:name="_Toc1006"/>
       <w:pPr>
         <w:pStyle w:val="Heading2"/>
         <w:jc w:val="left"/>
@@ -1938,6 +1766,7 @@
         <w:t xml:space="preserve">1.5  Part 4 – Disks and kernel data as files</w:t>
       </w:r>
       <w:bookmarkEnd w:id="7"/>
+      <w:bookmarkEnd w:id="1006"/>
     </w:p>
     <w:p>
       <w:pPr>
@@ -2235,6 +2064,7 @@
       </w:r>
     </w:p>
     <w:p>
+      <w:bookmarkStart w:id="1007" w:name="_Toc1007"/>
       <w:pPr>
         <w:pStyle w:val="Heading2"/>
         <w:jc w:val="left"/>
@@ -2249,6 +2079,7 @@
         <w:t xml:space="preserve">1.6  Conclusion</w:t>
       </w:r>
       <w:bookmarkEnd w:id="8"/>
+      <w:bookmarkEnd w:id="1007"/>
     </w:p>
     <w:p>
       <w:pPr>
@@ -2293,6 +2124,7 @@
       </w:r>
     </w:p>
     <w:p>
+      <w:bookmarkStart w:id="1008" w:name="_Toc1008"/>
       <w:pPr>
         <w:pStyle w:val="Heading1"/>
         <w:jc w:val="left"/>
@@ -2307,8 +2139,10 @@
         <w:t xml:space="preserve">2.  Laboratory Work 6 – Inside the xv6 File System</w:t>
       </w:r>
       <w:bookmarkEnd w:id="9"/>
-    </w:p>
-    <w:p>
+      <w:bookmarkEnd w:id="1008"/>
+    </w:p>
+    <w:p>
+      <w:bookmarkStart w:id="1009" w:name="_Toc1009"/>
       <w:pPr>
         <w:pStyle w:val="Heading2"/>
         <w:jc w:val="left"/>
@@ -2323,6 +2157,7 @@
         <w:t xml:space="preserve">2.1  Part 1 – Read what xv6 shows you</w:t>
       </w:r>
       <w:bookmarkEnd w:id="10"/>
+      <w:bookmarkEnd w:id="1009"/>
     </w:p>
     <w:p>
       <w:pPr>
@@ -2621,6 +2456,7 @@
       </w:r>
     </w:p>
     <w:p>
+      <w:bookmarkStart w:id="1010" w:name="_Toc1010"/>
       <w:pPr>
         <w:pStyle w:val="Heading2"/>
         <w:jc w:val="left"/>
@@ -2635,6 +2471,7 @@
         <w:t xml:space="preserve">2.2  Part 2 – Write mystat</w:t>
       </w:r>
       <w:bookmarkEnd w:id="11"/>
+      <w:bookmarkEnd w:id="1010"/>
     </w:p>
     <w:p>
       <w:pPr>
@@ -3281,6 +3118,7 @@
       </w:r>
     </w:p>
     <w:p>
+      <w:bookmarkStart w:id="1011" w:name="_Toc1011"/>
       <w:pPr>
         <w:pStyle w:val="Heading2"/>
         <w:jc w:val="left"/>
@@ -3295,6 +3133,7 @@
         <w:t xml:space="preserve">2.3  Part 3 – Measure the limits</w:t>
       </w:r>
       <w:bookmarkEnd w:id="12"/>
+      <w:bookmarkEnd w:id="1011"/>
     </w:p>
     <w:p>
       <w:pPr>
@@ -3865,6 +3704,7 @@
       </w:r>
     </w:p>
     <w:p>
+      <w:bookmarkStart w:id="1012" w:name="_Toc1012"/>
       <w:pPr>
         <w:pStyle w:val="Heading2"/>
         <w:jc w:val="left"/>
@@ -3879,6 +3719,7 @@
         <w:t xml:space="preserve">2.4  Part 4 – Write find</w:t>
       </w:r>
       <w:bookmarkEnd w:id="13"/>
+      <w:bookmarkEnd w:id="1012"/>
     </w:p>
     <w:p>
       <w:pPr>
@@ -4302,6 +4143,7 @@
       </w:r>
     </w:p>
     <w:p>
+      <w:bookmarkStart w:id="1013" w:name="_Toc1013"/>
       <w:pPr>
         <w:pStyle w:val="Heading2"/>
         <w:jc w:val="left"/>
@@ -4316,6 +4158,7 @@
         <w:t xml:space="preserve">2.5  Conclusion</w:t>
       </w:r>
       <w:bookmarkEnd w:id="14"/>
+      <w:bookmarkEnd w:id="1013"/>
     </w:p>
     <w:p>
       <w:pPr>

</xml_diff>